<commit_message>
print templates add update
</commit_message>
<xml_diff>
--- a/public/templates/medegdeh_huudas_org.docx
+++ b/public/templates/medegdeh_huudas_org.docx
@@ -25,8 +25,8 @@
         </w:rPr>
         <w:t>{owner_name}</w:t>
       </w:r>
-      <w:bookmarkStart w:id="0" w:name="_Hlk201581015"/>
-      <w:bookmarkStart w:id="1" w:name="_Hlk201580968"/>
+      <w:bookmarkStart w:id="0" w:name="_Hlk201580968"/>
+      <w:bookmarkStart w:id="1" w:name="_Hlk201581015"/>
       <w:r>
         <w:rPr>
           <w:rFonts w:cs="Arial" w:ascii="Arial" w:hAnsi="Arial"/>
@@ -487,11 +487,11 @@
           <w:sz w:val="22"/>
           <w:szCs w:val="22"/>
         </w:rPr>
-        <w:t>acquisition_area_m2</w:t>
-      </w:r>
-      <w:r>
-        <w:rPr>
-          <w:rFonts w:ascii="Arial" w:hAnsi="Arial"/>
+        <w:t xml:space="preserve">acquisition_area_m2} </w:t>
+      </w:r>
+      <w:r>
+        <w:rPr>
+          <w:rFonts w:cs="Arial" w:ascii="Arial" w:hAnsi="Arial"/>
           <w:b w:val="false"/>
           <w:i w:val="false"/>
           <w:caps w:val="false"/>
@@ -499,9 +499,10 @@
           <w:color w:val="auto"/>
           <w:spacing w:val="0"/>
           <w:sz w:val="22"/>
-          <w:szCs w:val="22"/>
-        </w:rPr>
-        <w:t>}</w:t>
+          <w:szCs w:val="30"/>
+          <w:lang w:val="mn-Cyrl-MN" w:bidi="mn-Mong-MN"/>
+        </w:rPr>
+        <w:t>м.кв талбай өртсөн байна.</w:t>
       </w:r>
     </w:p>
     <w:p>

</xml_diff>